<commit_message>
update nir ind task
</commit_message>
<xml_diff>
--- a/2_2025-2/10_nir-prac/upload/Трифонов_НИР_Индивидуальное-задание.docx
+++ b/2_2025-2/10_nir-prac/upload/Трифонов_НИР_Индивидуальное-задание.docx
@@ -9454,7 +9454,7 @@
               <w:jc w:val="center"/>
             </w:pPr>
             <w:r>
-              <w:t>в работе</w:t>
+              <w:t>выполнено</w:t>
             </w:r>
           </w:p>
         </w:tc>
@@ -11334,7 +11334,7 @@
 </file>
 
 <file path=customXml/itemProps1.xml><?xml version="1.0" encoding="utf-8"?>
-<ds:datastoreItem xmlns:ds="http://schemas.openxmlformats.org/officeDocument/2006/customXml" ds:itemID="{0095BD7A-5AD8-457D-817C-CB3954BA24A1}">
+<ds:datastoreItem xmlns:ds="http://schemas.openxmlformats.org/officeDocument/2006/customXml" ds:itemID="{945A8DF6-A048-48CB-A445-CCC06DDAAE86}">
   <ds:schemaRefs>
     <ds:schemaRef ds:uri="http://schemas.openxmlformats.org/officeDocument/2006/bibliography"/>
   </ds:schemaRefs>

</xml_diff>